<commit_message>
more bibr updates (not all tests pass yet)
</commit_message>
<xml_diff>
--- a/tests/testthat/fixtures/formats/to_err_is_human.docx
+++ b/tests/testthat/fixtures/formats/to_err_is_human.docx
@@ -23,7 +23,7 @@
         <w:pStyle w:val="Date"/>
       </w:pPr>
       <w:r>
-        <w:t xml:space="preserve">2025-11-28</w:t>
+        <w:t xml:space="preserve">2026-02-19</w:t>
       </w:r>
     </w:p>
     <w:p>
@@ -31,7 +31,7 @@
         <w:pStyle w:val="FirstParagraph"/>
       </w:pPr>
       <w:r>
-        <w:t xml:space="preserve">This paper demonstrates some good and poor practices for use with the {metacheck} R package and Shiny app. All data are simulated. The paper shows examples of (1) open and closed OSF links; (2a) citation of retracted papers, (2b) citations without a doi, (2c) citations with Pubpeer comments, (2d) citations in the FORTT replication database, and (2e) missing/mismatched/incorrect citations and references; (3a) R files with code on GitHub that do not load libraries in one location, (3b) load files that are not shared in the repository, (3c) lack comments, and (3d) have hard-coded files, (4) imprecise reporting of non-significant p-values; (5) tests with and without effect sizes, (6) use of</w:t>
+        <w:t xml:space="preserve">This paper demonstrates some good and poor practices for use with the {metacheck} R package. All data are simulated. The paper shows examples of (1) open and closed OSF links; (2a) citation of retracted papers, (2b) citations without a doi, (2c) citations with Pubpeer comments, (2d) citations in the FLoRA replication database, and (2e) missing/mismatched/incorrect citations and references; (3a) R files with code on GitHub that do not load libraries in one location, (3b) load files that are not shared in the repository, (3c) lack comments, and (3d) have absolute file paths; (4) imprecise reporting of non-significant p-values; (5) tests with and without effect sizes; (6) use of</w:t>
       </w:r>
       <w:r>
         <w:t xml:space="preserve"> </w:t>
@@ -43,7 +43,7 @@
         <w:t xml:space="preserve"> </w:t>
       </w:r>
       <w:r>
-        <w:t xml:space="preserve">to describe non-significant findings, and (7) retrieving information from preregistrations.</w:t>
+        <w:t xml:space="preserve">to describe non-significant findings; (7) a power analysis reporting some of the essential attributes; and (8) retrieving information from preregistrations.</w:t>
       </w:r>
     </w:p>
     <w:bookmarkStart w:id="20" w:name="introduction"/>
@@ -64,13 +64,13 @@
       </w:r>
     </w:p>
     <w:bookmarkEnd w:id="20"/>
-    <w:bookmarkStart w:id="21" w:name="method-and-participants"/>
+    <w:bookmarkStart w:id="21" w:name="method"/>
     <w:p>
       <w:pPr>
         <w:pStyle w:val="Heading2"/>
       </w:pPr>
       <w:r>
-        <w:t xml:space="preserve">Method and Participants</w:t>
+        <w:t xml:space="preserve">Method</w:t>
       </w:r>
     </w:p>
     <w:p>
@@ -78,19 +78,65 @@
         <w:pStyle w:val="FirstParagraph"/>
       </w:pPr>
       <w:r>
-        <w:t xml:space="preserve">In this study we examine whether automated checks reduce the amount of errors that researchers make in scientific manuscripts. This study was preregistered at https://osf.io/48ncu and on AsPredicted at https://aspredicted.org/by8i8v.pdf. We randomly assigned 50 scientists to a condition where their manuscript was automatically checked for errors, and 50 scientists to a control condition with a checklist. Scientists had the opportunity to make changes to their manuscript based on the feedback of the tool. We subsequently coded all manuscripts for mistakes, and counted the total number of mistakes. We also measured the expertise of researchers (in years) to explore whether the automated tool would be more useful, the less research experience researchers had. We also asked researchers to rate how useful they found the checklist or app on a scale from 1 (not at all) to 7 (extremely useful). Data and analysis code is available on GitHub from https://github.com/Lakens/to_err_is_human and from https://researchbox.org/4377. Data is also available from https://osf.io/5tbm9 and code is also available from https://osf.io/629bx.</w:t>
-      </w:r>
-    </w:p>
-    <w:p>
-      <w:pPr>
-        <w:pStyle w:val="BodyText"/>
+        <w:t xml:space="preserve">In this study we examine whether automated checks reduce the amount of errors that researchers make in scientific manuscripts. This study was preregistered at https://osf.io/48ncu and on AsPredicted at https://aspredicted.org/by8i8v.pdf.</w:t>
+      </w:r>
+    </w:p>
+    <w:bookmarkEnd w:id="21"/>
+    <w:bookmarkStart w:id="22" w:name="procedure"/>
+    <w:p>
+      <w:pPr>
+        <w:pStyle w:val="Heading2"/>
+      </w:pPr>
+      <w:r>
+        <w:t xml:space="preserve">Procedure</w:t>
+      </w:r>
+    </w:p>
+    <w:p>
+      <w:pPr>
+        <w:pStyle w:val="FirstParagraph"/>
+      </w:pPr>
+      <w:r>
+        <w:t xml:space="preserve">We randomly assigned 50 scientists to a condition where their manuscript was automatically checked for errors, and 50 scientists to a control condition with a checklist. Scientists had the opportunity to make changes to their manuscript based on the feedback of the tool. We subsequently coded all manuscripts for mistakes, and counted the total number of mistakes. We also measured the expertise of researchers (in years) to explore whether the automated tool would be more useful, the less research experience researchers had. We also asked researchers to rate how useful they found the checklist or app on a scale from 1 (not at all) to 7 (extremely useful).</w:t>
+      </w:r>
+    </w:p>
+    <w:bookmarkEnd w:id="22"/>
+    <w:bookmarkStart w:id="23" w:name="data-availability"/>
+    <w:p>
+      <w:pPr>
+        <w:pStyle w:val="Heading2"/>
+      </w:pPr>
+      <w:r>
+        <w:t xml:space="preserve">Data Availability</w:t>
+      </w:r>
+    </w:p>
+    <w:p>
+      <w:pPr>
+        <w:pStyle w:val="FirstParagraph"/>
+      </w:pPr>
+      <w:r>
+        <w:t xml:space="preserve">Data and analysis code is available on GitHub from https://github.com/Lakens/to_err_is_human and from https://researchbox.org/4377. Data is also available from https://osf.io/5tbm9 and code is also available from https://osf.io/629bx.</w:t>
+      </w:r>
+    </w:p>
+    <w:bookmarkEnd w:id="23"/>
+    <w:bookmarkStart w:id="24" w:name="power-analysis"/>
+    <w:p>
+      <w:pPr>
+        <w:pStyle w:val="Heading2"/>
+      </w:pPr>
+      <w:r>
+        <w:t xml:space="preserve">Power Analysis</w:t>
+      </w:r>
+    </w:p>
+    <w:p>
+      <w:pPr>
+        <w:pStyle w:val="FirstParagraph"/>
       </w:pPr>
       <w:r>
         <w:t xml:space="preserve">We conducted a sensitivity power analysis to determine that a Cohen’s d of 0.50 is the smallest effect size that we could detect with 50 participants in each group and 80% power.</w:t>
       </w:r>
     </w:p>
-    <w:bookmarkEnd w:id="21"/>
-    <w:bookmarkStart w:id="30" w:name="results"/>
+    <w:bookmarkEnd w:id="24"/>
+    <w:bookmarkStart w:id="33" w:name="results"/>
     <w:p>
       <w:pPr>
         <w:pStyle w:val="Heading2"/>
@@ -112,7 +158,7 @@
       <w:tr>
         <w:tc>
           <w:tcPr/>
-          <w:bookmarkStart w:id="25" w:name="fig-sim"/>
+          <w:bookmarkStart w:id="28" w:name="fig-sim"/>
           <w:p>
             <w:pPr>
               <w:pStyle w:val="Compact"/>
@@ -123,18 +169,18 @@
                 <wp:inline>
                   <wp:extent cx="5334000" cy="4267200"/>
                   <wp:effectExtent b="0" l="0" r="0" t="0"/>
-                  <wp:docPr descr="" title="" id="23" name="Picture"/>
+                  <wp:docPr descr="" title="" id="26" name="Picture"/>
                   <a:graphic>
                     <a:graphicData uri="http://schemas.openxmlformats.org/drawingml/2006/picture">
                       <pic:pic>
                         <pic:nvPicPr>
-                          <pic:cNvPr descr="to_err_is_human_files/figure-docx/fig-sim-1.png" id="24" name="Picture"/>
+                          <pic:cNvPr descr="to_err_is_human_files/figure-docx/fig-sim-1.png" id="27" name="Picture"/>
                           <pic:cNvPicPr>
                             <a:picLocks noChangeArrowheads="1" noChangeAspect="1"/>
                           </pic:cNvPicPr>
                         </pic:nvPicPr>
                         <pic:blipFill>
-                          <a:blip r:embed="rId22"/>
+                          <a:blip r:embed="rId25"/>
                           <a:stretch>
                             <a:fillRect/>
                           </a:stretch>
@@ -166,7 +212,7 @@
               <w:jc w:val="center"/>
             </w:pPr>
             <w:pPr>
-              <w:jc w:val="start"/>
+              <w:jc w:val="left"/>
               <w:spacing w:before="200"/>
               <w:pStyle w:val="ImageCaption"/>
             </w:pPr>
@@ -174,7 +220,7 @@
               <w:t xml:space="preserve">Figure 1: The simulated data</w:t>
             </w:r>
           </w:p>
-          <w:bookmarkEnd w:id="25"/>
+          <w:bookmarkEnd w:id="28"/>
         </w:tc>
       </w:tr>
     </w:tbl>
@@ -191,13 +237,13 @@
       <w:tr>
         <w:tc>
           <w:tcPr/>
-          <w:bookmarkStart w:id="26" w:name="tbl-summary"/>
+          <w:bookmarkStart w:id="29" w:name="tbl-summary"/>
           <w:p>
             <w:pPr>
               <w:jc w:val="center"/>
             </w:pPr>
             <w:pPr>
-              <w:jc w:val="start"/>
+              <w:jc w:val="left"/>
               <w:spacing w:before="200"/>
               <w:pStyle w:val="ImageCaption"/>
             </w:pPr>
@@ -343,7 +389,7 @@
               </w:tc>
             </w:tr>
           </w:tbl>
-          <w:bookmarkEnd w:id="26"/>
+          <w:bookmarkEnd w:id="29"/>
           <w:p/>
         </w:tc>
       </w:tr>
@@ -483,18 +529,18 @@
           <wp:inline>
             <wp:extent cx="5334000" cy="4267200"/>
             <wp:effectExtent b="0" l="0" r="0" t="0"/>
-            <wp:docPr descr="" title="" id="28" name="Picture"/>
+            <wp:docPr descr="" title="" id="31" name="Picture"/>
             <a:graphic>
               <a:graphicData uri="http://schemas.openxmlformats.org/drawingml/2006/picture">
                 <pic:pic>
                   <pic:nvPicPr>
-                    <pic:cNvPr descr="to_err_is_human_files/figure-docx/unnamed-chunk-2-1.png" id="29" name="Picture"/>
+                    <pic:cNvPr descr="to_err_is_human_files/figure-docx/unnamed-chunk-2-1.png" id="32" name="Picture"/>
                     <pic:cNvPicPr>
                       <a:picLocks noChangeArrowheads="1" noChangeAspect="1"/>
                     </pic:cNvPicPr>
                   </pic:nvPicPr>
                   <pic:blipFill>
-                    <a:blip r:embed="rId27"/>
+                    <a:blip r:embed="rId30"/>
                     <a:stretch>
                       <a:fillRect/>
                     </a:stretch>
@@ -542,8 +588,8 @@
         <w:t xml:space="preserve">&gt; .05), as the correlation was non-significant.</w:t>
       </w:r>
     </w:p>
-    <w:bookmarkEnd w:id="30"/>
-    <w:bookmarkStart w:id="31" w:name="discussion"/>
+    <w:bookmarkEnd w:id="33"/>
+    <w:bookmarkStart w:id="34" w:name="discussion"/>
     <w:p>
       <w:pPr>
         <w:pStyle w:val="Heading2"/>
@@ -560,8 +606,8 @@
         <w:t xml:space="preserve">It seems automated tools can help prevent errors by providing researchers with feedback about potential mistakes, and researchers feel the app is useful. We conclude the use of automated checks has potential to reduce the number of mistakes in scientific manuscripts.</w:t>
       </w:r>
     </w:p>
-    <w:bookmarkEnd w:id="31"/>
-    <w:bookmarkStart w:id="32" w:name="references"/>
+    <w:bookmarkEnd w:id="34"/>
+    <w:bookmarkStart w:id="35" w:name="references"/>
     <w:p>
       <w:pPr>
         <w:pStyle w:val="Heading2"/>
@@ -575,7 +621,7 @@
         <w:pStyle w:val="FirstParagraph"/>
       </w:pPr>
       <w:r>
-        <w:t xml:space="preserve">Gangestad, S. W., &amp; Thornhill, R. (1998). Menstrual cycle variation in women’s preferences for the scent of symmetrical men. Proceedings Biological Sciences, 22, 927-933. doi: 10.1098/rspb.1998.0380.</w:t>
+        <w:t xml:space="preserve">Eagly, A. H., &amp; Wood, W. (1999). The origins of sex differences in human behavior: Evolved dispositions versus social roles. American Psychologist, 54(6), 408–423. https://doi.org/10.1037/0003-066x.54.6.408</w:t>
       </w:r>
     </w:p>
     <w:p>
@@ -591,18 +637,18 @@
         <w:pStyle w:val="BodyText"/>
       </w:pPr>
       <w:r>
+        <w:t xml:space="preserve">Lakens, D. (2018). Equivalence testing for psychological research. Advances in Methods and Practices in Psychological Science, 1, 259-270.</w:t>
+      </w:r>
+    </w:p>
+    <w:p>
+      <w:pPr>
+        <w:pStyle w:val="BodyText"/>
+      </w:pPr>
+      <w:r>
         <w:t xml:space="preserve">Smith, F. (2021). Human error is a symptom of a poor design. Journal of Journals, 0(0), 0. https://doi.org/10.0000/0123456789</w:t>
       </w:r>
     </w:p>
-    <w:p>
-      <w:pPr>
-        <w:pStyle w:val="BodyText"/>
-      </w:pPr>
-      <w:r>
-        <w:t xml:space="preserve">Lakens, D. (2018). Equivalence testing for psychological research. Advances in Methods and Practices in Psychological Science, 1, 259-270.</w:t>
-      </w:r>
-    </w:p>
-    <w:bookmarkEnd w:id="32"/>
+    <w:bookmarkEnd w:id="35"/>
     <w:sectPr>
       <w:footnotePr>
         <w:numRestart w:val="eachSect"/>

</xml_diff>